<commit_message>
Scrolling and the template fixed
</commit_message>
<xml_diff>
--- a/backend/template.docx
+++ b/backend/template.docx
@@ -910,6 +910,8 @@
         <w:rPr>
           <w:b w:val="false"/>
           <w:bCs w:val="false"/>
+          <w:i w:val="false"/>
+          <w:iCs w:val="false"/>
           <w:color w:themeColor="dark1" w:val="000000"/>
           <w:shd w:fill="FFFFFF" w:val="clear"/>
         </w:rPr>
@@ -1023,43 +1025,6 @@
           <w:shd w:fill="FFFFFF" w:val="clear"/>
         </w:rPr>
         <w:t xml:space="preserve">}}) </w:t>
-      </w:r>
-    </w:p>
-    <w:p>
-      <w:pPr>
-        <w:pStyle w:val="BodyText"/>
-        <w:spacing w:before="267" w:after="283"/>
-        <w:ind w:hanging="0" w:left="0" w:right="0"/>
-        <w:jc w:val="both"/>
-        <w:rPr/>
-      </w:pPr>
-      <w:r>
-        <w:rPr>
-          <w:b w:val="false"/>
-          <w:bCs w:val="false"/>
-          <w:color w:themeColor="dark1" w:val="000000"/>
-          <w:shd w:fill="FFFFFF" w:val="clear"/>
-        </w:rPr>
-        <w:t xml:space="preserve">        </w:t>
-      </w:r>
-      <w:r>
-        <w:rPr>
-          <w:b w:val="false"/>
-          <w:bCs w:val="false"/>
-          <w:i/>
-          <w:color w:themeColor="dark1" w:val="000000"/>
-          <w:shd w:fill="FFFFFF" w:val="clear"/>
-        </w:rPr>
-        <w:t>Kindly review the annexure for the CTC details.</w:t>
-      </w:r>
-      <w:r>
-        <w:rPr>
-          <w:b w:val="false"/>
-          <w:bCs w:val="false"/>
-          <w:color w:themeColor="dark1" w:val="000000"/>
-          <w:shd w:fill="FFFFFF" w:val="clear"/>
-        </w:rPr>
-        <w:t> </w:t>
       </w:r>
     </w:p>
     <w:p>
@@ -1068,8 +1033,8 @@
         <w:widowControl w:val="false"/>
         <w:suppressAutoHyphens w:val="true"/>
         <w:bidi w:val="0"/>
-        <w:spacing w:lineRule="auto" w:line="276" w:before="267" w:after="283"/>
-        <w:ind w:hanging="0" w:left="180" w:right="0"/>
+        <w:spacing w:lineRule="auto" w:line="276" w:before="0" w:after="0"/>
+        <w:ind w:hanging="0" w:left="449" w:right="0"/>
         <w:jc w:val="both"/>
         <w:rPr/>
       </w:pPr>
@@ -1077,6 +1042,53 @@
         <w:rPr>
           <w:b w:val="false"/>
           <w:bCs w:val="false"/>
+          <w:i w:val="false"/>
+          <w:iCs w:val="false"/>
+          <w:color w:themeColor="dark1" w:val="000000"/>
+          <w:shd w:fill="FFFFFF" w:val="clear"/>
+        </w:rPr>
+        <w:t>Kindly review the annexure for the CTC details.</w:t>
+      </w:r>
+      <w:r>
+        <w:rPr>
+          <w:b w:val="false"/>
+          <w:bCs w:val="false"/>
+          <w:i w:val="false"/>
+          <w:iCs w:val="false"/>
+          <w:color w:themeColor="dark1" w:val="000000"/>
+          <w:shd w:fill="FFFFFF" w:val="clear"/>
+        </w:rPr>
+        <w:t> </w:t>
+      </w:r>
+    </w:p>
+    <w:p>
+      <w:pPr>
+        <w:pStyle w:val="BodyText"/>
+        <w:widowControl w:val="false"/>
+        <w:suppressAutoHyphens w:val="true"/>
+        <w:bidi w:val="0"/>
+        <w:spacing w:lineRule="auto" w:line="276" w:before="0" w:after="0"/>
+        <w:ind w:hanging="0" w:left="449" w:right="0"/>
+        <w:jc w:val="both"/>
+        <w:rPr/>
+      </w:pPr>
+      <w:r>
+        <w:rPr>
+          <w:b w:val="false"/>
+          <w:bCs w:val="false"/>
+          <w:i w:val="false"/>
+          <w:iCs w:val="false"/>
+          <w:color w:themeColor="dark1" w:val="000000"/>
+          <w:shd w:fill="FFFFFF" w:val="clear"/>
+        </w:rPr>
+        <w:br/>
+      </w:r>
+      <w:r>
+        <w:rPr>
+          <w:b w:val="false"/>
+          <w:bCs w:val="false"/>
+          <w:i w:val="false"/>
+          <w:iCs w:val="false"/>
           <w:color w:themeColor="dark1" w:val="000000"/>
           <w:shd w:fill="FFFFFF" w:val="clear"/>
         </w:rPr>
@@ -1159,6 +1171,8 @@
           <w:rStyle w:val="Strong"/>
           <w:b w:val="false"/>
           <w:bCs w:val="false"/>
+          <w:i w:val="false"/>
+          <w:iCs w:val="false"/>
           <w:color w:themeColor="dark1" w:val="000000"/>
           <w:shd w:fill="FFFFFF" w:val="clear"/>
         </w:rPr>
@@ -1166,8 +1180,30 @@
       </w:r>
       <w:r>
         <w:rPr>
+          <w:rStyle w:val="Strong"/>
+          <w:rFonts w:eastAsia="Calibri" w:cs="Calibri"/>
           <w:b w:val="false"/>
           <w:bCs w:val="false"/>
+          <w:i w:val="false"/>
+          <w:iCs w:val="false"/>
+          <w:caps w:val="false"/>
+          <w:smallCaps w:val="false"/>
+          <w:strike w:val="false"/>
+          <w:dstrike w:val="false"/>
+          <w:color w:val="000000"/>
+          <w:sz w:val="22"/>
+          <w:szCs w:val="22"/>
+          <w:u w:val="none"/>
+          <w:shd w:fill="auto" w:val="clear"/>
+        </w:rPr>
+        <w:t>{% if has_revised_ctc %}</w:t>
+      </w:r>
+      <w:r>
+        <w:rPr>
+          <w:b w:val="false"/>
+          <w:bCs w:val="false"/>
+          <w:i w:val="false"/>
+          <w:iCs w:val="false"/>
           <w:color w:themeColor="dark1" w:val="000000"/>
           <w:shd w:fill="FFFFFF" w:val="clear"/>
         </w:rPr>
@@ -1267,6 +1303,8 @@
         <w:rPr>
           <w:b w:val="false"/>
           <w:bCs w:val="false"/>
+          <w:i w:val="false"/>
+          <w:iCs w:val="false"/>
           <w:color w:themeColor="dark1" w:val="000000"/>
           <w:shd w:fill="FFFFFF" w:val="clear"/>
         </w:rPr>
@@ -1277,6 +1315,8 @@
           <w:rStyle w:val="Strong"/>
           <w:b w:val="false"/>
           <w:bCs w:val="false"/>
+          <w:i w:val="false"/>
+          <w:iCs w:val="false"/>
           <w:color w:themeColor="dark1" w:val="000000"/>
           <w:shd w:fill="FFFFFF" w:val="clear"/>
         </w:rPr>
@@ -1286,6 +1326,8 @@
         <w:rPr>
           <w:b w:val="false"/>
           <w:bCs w:val="false"/>
+          <w:i w:val="false"/>
+          <w:iCs w:val="false"/>
           <w:color w:themeColor="dark1" w:val="000000"/>
           <w:shd w:fill="FFFFFF" w:val="clear"/>
         </w:rPr>
@@ -1296,6 +1338,8 @@
           <w:rStyle w:val="Strong"/>
           <w:b w:val="false"/>
           <w:bCs w:val="false"/>
+          <w:i w:val="false"/>
+          <w:iCs w:val="false"/>
           <w:color w:themeColor="dark1" w:val="000000"/>
           <w:shd w:fill="FFFFFF" w:val="clear"/>
         </w:rPr>
@@ -1305,6 +1349,8 @@
         <w:rPr>
           <w:b w:val="false"/>
           <w:bCs w:val="false"/>
+          <w:i w:val="false"/>
+          <w:iCs w:val="false"/>
           <w:color w:themeColor="dark1" w:val="000000"/>
           <w:shd w:fill="FFFFFF" w:val="clear"/>
         </w:rPr>
@@ -1315,6 +1361,8 @@
           <w:rStyle w:val="Strong"/>
           <w:b w:val="false"/>
           <w:bCs w:val="false"/>
+          <w:i w:val="false"/>
+          <w:iCs w:val="false"/>
           <w:color w:themeColor="dark1" w:val="000000"/>
           <w:shd w:fill="FFFFFF" w:val="clear"/>
         </w:rPr>
@@ -1324,61 +1372,12 @@
         <w:rPr>
           <w:b w:val="false"/>
           <w:bCs w:val="false"/>
+          <w:i w:val="false"/>
+          <w:iCs w:val="false"/>
           <w:color w:themeColor="dark1" w:val="000000"/>
           <w:shd w:fill="FFFFFF" w:val="clear"/>
         </w:rPr>
         <w:t>. </w:t>
-      </w:r>
-    </w:p>
-    <w:p>
-      <w:pPr>
-        <w:pStyle w:val="BodyText"/>
-        <w:spacing w:before="267" w:after="283"/>
-        <w:ind w:hanging="0" w:left="0" w:right="0"/>
-        <w:jc w:val="both"/>
-        <w:rPr/>
-      </w:pPr>
-      <w:r>
-        <w:rPr>
-          <w:rStyle w:val="Strong"/>
-          <w:b w:val="false"/>
-          <w:bCs w:val="false"/>
-          <w:i/>
-          <w:color w:themeColor="dark1" w:val="000000"/>
-          <w:shd w:fill="FFFFFF" w:val="clear"/>
-        </w:rPr>
-        <w:t xml:space="preserve">   </w:t>
-      </w:r>
-      <w:r>
-        <w:rPr>
-          <w:rStyle w:val="Strong"/>
-          <w:b/>
-          <w:bCs/>
-          <w:i/>
-          <w:color w:themeColor="dark1" w:val="000000"/>
-          <w:shd w:fill="FFFFFF" w:val="clear"/>
-        </w:rPr>
-        <w:t xml:space="preserve"> </w:t>
-      </w:r>
-      <w:r>
-        <w:rPr>
-          <w:rStyle w:val="Strong"/>
-          <w:b/>
-          <w:bCs/>
-          <w:i/>
-          <w:color w:themeColor="dark1" w:val="000000"/>
-          <w:shd w:fill="FFFFFF" w:val="clear"/>
-        </w:rPr>
-        <w:t>Post Customer Selection:</w:t>
-      </w:r>
-      <w:r>
-        <w:rPr>
-          <w:b/>
-          <w:bCs/>
-          <w:color w:themeColor="dark1" w:val="000000"/>
-          <w:shd w:fill="FFFFFF" w:val="clear"/>
-        </w:rPr>
-        <w:t> </w:t>
       </w:r>
     </w:p>
     <w:p>
@@ -1392,7 +1391,7 @@
           <w:tab w:val="clear" w:pos="720"/>
           <w:tab w:val="left" w:pos="0" w:leader="none"/>
         </w:tabs>
-        <w:spacing w:before="267" w:after="283"/>
+        <w:spacing w:lineRule="auto" w:line="240" w:before="114" w:after="114"/>
         <w:ind w:hanging="283" w:left="709" w:right="0"/>
         <w:jc w:val="both"/>
         <w:rPr/>
@@ -1401,7 +1400,8 @@
         <w:rPr>
           <w:b w:val="false"/>
           <w:bCs w:val="false"/>
-          <w:i/>
+          <w:i w:val="false"/>
+          <w:iCs w:val="false"/>
           <w:color w:themeColor="dark1" w:val="000000"/>
           <w:shd w:fill="FFFFFF" w:val="clear"/>
         </w:rPr>
@@ -1412,17 +1412,110 @@
           <w:rStyle w:val="Strong"/>
           <w:b w:val="false"/>
           <w:bCs w:val="false"/>
-          <w:i/>
+          <w:i w:val="false"/>
+          <w:iCs w:val="false"/>
           <w:color w:themeColor="dark1" w:val="000000"/>
           <w:shd w:fill="FFFFFF" w:val="clear"/>
         </w:rPr>
-        <w:t>INR 9,00,000 (Rupees Nine Lakh Only) </w:t>
-      </w:r>
-      <w:r>
-        <w:rPr>
+        <w:t>INR </w:t>
+      </w:r>
+      <w:r>
+        <w:rPr>
+          <w:rStyle w:val="Strong"/>
+          <w:rFonts w:eastAsia="SimSun" w:cs="Calibri"/>
+          <w:b/>
+          <w:bCs/>
+          <w:i w:val="false"/>
+          <w:iCs w:val="false"/>
+          <w:caps w:val="false"/>
+          <w:smallCaps w:val="false"/>
+          <w:color w:themeColor="dark1" w:val="000000"/>
+          <w:spacing w:val="0"/>
+          <w:sz w:val="22"/>
+          <w:szCs w:val="22"/>
+          <w:shd w:fill="FFFFFF" w:val="clear"/>
+        </w:rPr>
+        <w:t>{{Revised_CTC}}</w:t>
+      </w:r>
+      <w:r>
+        <w:rPr>
+          <w:rStyle w:val="Strong"/>
+          <w:rFonts w:eastAsia="SimSun" w:cs="Calibri"/>
           <w:b w:val="false"/>
           <w:bCs w:val="false"/>
-          <w:i/>
+          <w:i w:val="false"/>
+          <w:iCs w:val="false"/>
+          <w:caps w:val="false"/>
+          <w:smallCaps w:val="false"/>
+          <w:color w:themeColor="dark1" w:val="000000"/>
+          <w:spacing w:val="0"/>
+          <w:sz w:val="22"/>
+          <w:szCs w:val="22"/>
+          <w:shd w:fill="FFFFFF" w:val="clear"/>
+        </w:rPr>
+        <w:t> </w:t>
+      </w:r>
+      <w:r>
+        <w:rPr>
+          <w:rStyle w:val="Strong"/>
+          <w:rFonts w:eastAsia="SimSun" w:cs="Calibri"/>
+          <w:b/>
+          <w:bCs/>
+          <w:i w:val="false"/>
+          <w:iCs w:val="false"/>
+          <w:caps w:val="false"/>
+          <w:smallCaps w:val="false"/>
+          <w:color w:themeColor="dark1" w:val="000000"/>
+          <w:spacing w:val="0"/>
+          <w:sz w:val="22"/>
+          <w:szCs w:val="22"/>
+          <w:shd w:fill="FFFFFF" w:val="clear"/>
+        </w:rPr>
+        <w:t>( {{Revised_CTC</w:t>
+      </w:r>
+      <w:r>
+        <w:rPr>
+          <w:rStyle w:val="Strong"/>
+          <w:rFonts w:eastAsia="SimSun" w:cs="Calibri"/>
+          <w:b/>
+          <w:bCs/>
+          <w:i w:val="false"/>
+          <w:iCs w:val="false"/>
+          <w:caps w:val="false"/>
+          <w:smallCaps w:val="false"/>
+          <w:color w:themeColor="dark1" w:val="000000"/>
+          <w:spacing w:val="0"/>
+          <w:sz w:val="22"/>
+          <w:szCs w:val="22"/>
+          <w:shd w:fill="FFFFFF" w:val="clear"/>
+          <w:lang w:val="en-US"/>
+        </w:rPr>
+        <w:t>_Words</w:t>
+      </w:r>
+      <w:r>
+        <w:rPr>
+          <w:rStyle w:val="Strong"/>
+          <w:rFonts w:eastAsia="SimSun" w:cs="Calibri"/>
+          <w:b/>
+          <w:bCs/>
+          <w:i w:val="false"/>
+          <w:iCs w:val="false"/>
+          <w:caps w:val="false"/>
+          <w:smallCaps w:val="false"/>
+          <w:color w:themeColor="dark1" w:val="000000"/>
+          <w:spacing w:val="0"/>
+          <w:sz w:val="22"/>
+          <w:szCs w:val="22"/>
+          <w:shd w:fill="FFFFFF" w:val="clear"/>
+        </w:rPr>
+        <w:t>}})</w:t>
+      </w:r>
+      <w:r>
+        <w:rPr>
+          <w:b w:val="false"/>
+          <w:bCs w:val="false"/>
+          <w:i w:val="false"/>
+          <w:iCs w:val="false"/>
           <w:color w:themeColor="dark1" w:val="000000"/>
           <w:shd w:fill="FFFFFF" w:val="clear"/>
         </w:rPr>
@@ -1432,10 +1525,23 @@
         <w:rPr>
           <w:b/>
           <w:bCs/>
+          <w:i w:val="false"/>
+          <w:iCs w:val="false"/>
           <w:color w:themeColor="dark1" w:val="000000"/>
           <w:shd w:fill="FFFFFF" w:val="clear"/>
         </w:rPr>
         <w:t> </w:t>
+      </w:r>
+      <w:r>
+        <w:rPr>
+          <w:b w:val="false"/>
+          <w:bCs w:val="false"/>
+          <w:i w:val="false"/>
+          <w:iCs w:val="false"/>
+          <w:color w:themeColor="dark1" w:val="000000"/>
+          <w:shd w:fill="FFFFFF" w:val="clear"/>
+        </w:rPr>
+        <w:t>{% endif%}</w:t>
       </w:r>
     </w:p>
     <w:p>
@@ -1444,7 +1550,95 @@
         <w:widowControl w:val="false"/>
         <w:suppressAutoHyphens w:val="true"/>
         <w:bidi w:val="0"/>
-        <w:spacing w:lineRule="auto" w:line="276" w:before="267" w:after="283"/>
+        <w:spacing w:lineRule="auto" w:line="276" w:before="217" w:after="114"/>
+        <w:ind w:hanging="0" w:left="449" w:right="0"/>
+        <w:jc w:val="both"/>
+        <w:rPr/>
+      </w:pPr>
+      <w:r>
+        <w:rPr>
+          <w:b w:val="false"/>
+          <w:bCs w:val="false"/>
+          <w:i w:val="false"/>
+          <w:iCs w:val="false"/>
+          <w:color w:val="000000"/>
+          <w:shd w:fill="FFFFFF" w:val="clear"/>
+        </w:rPr>
+        <w:t>your 1st day of the next working month from the deployment date/ </w:t>
+      </w:r>
+      <w:r>
+        <w:rPr>
+          <w:b w:val="false"/>
+          <w:bCs w:val="false"/>
+          <w:i w:val="false"/>
+          <w:iCs w:val="false"/>
+          <w:color w:val="000000"/>
+          <w:shd w:fill="FFFFFF" w:val="clear"/>
+        </w:rPr>
+        <w:t xml:space="preserve">completion of </w:t>
+      </w:r>
+      <w:r>
+        <w:rPr>
+          <w:rStyle w:val="Strong"/>
+          <w:b w:val="false"/>
+          <w:bCs w:val="false"/>
+          <w:i w:val="false"/>
+          <w:iCs w:val="false"/>
+          <w:color w:val="000000"/>
+          <w:shd w:fill="FFFFFF" w:val="clear"/>
+        </w:rPr>
+        <w:t>six (6) months</w:t>
+      </w:r>
+      <w:r>
+        <w:rPr>
+          <w:b w:val="false"/>
+          <w:bCs w:val="false"/>
+          <w:i w:val="false"/>
+          <w:iCs w:val="false"/>
+          <w:color w:val="000000"/>
+          <w:shd w:fill="FFFFFF" w:val="clear"/>
+        </w:rPr>
+        <w:t xml:space="preserve"> of service </w:t>
+      </w:r>
+      <w:r>
+        <w:rPr>
+          <w:b w:val="false"/>
+          <w:bCs w:val="false"/>
+          <w:i w:val="false"/>
+          <w:iCs w:val="false"/>
+          <w:color w:val="000000"/>
+          <w:shd w:fill="FFFFFF" w:val="clear"/>
+        </w:rPr>
+        <w:t>whichever is applicable</w:t>
+      </w:r>
+      <w:r>
+        <w:rPr>
+          <w:b w:val="false"/>
+          <w:bCs w:val="false"/>
+          <w:i w:val="false"/>
+          <w:iCs w:val="false"/>
+          <w:color w:val="000000"/>
+          <w:shd w:fill="FFFFFF" w:val="clear"/>
+        </w:rPr>
+        <w:t>.</w:t>
+      </w:r>
+      <w:r>
+        <w:rPr>
+          <w:b w:val="false"/>
+          <w:bCs w:val="false"/>
+          <w:color w:val="000000"/>
+          <w:shd w:fill="FFFFFF" w:val="clear"/>
+        </w:rPr>
+        <w:t> </w:t>
+      </w:r>
+    </w:p>
+    <w:p>
+      <w:pPr>
+        <w:pStyle w:val="BodyText"/>
+        <w:widowControl w:val="false"/>
+        <w:suppressAutoHyphens w:val="true"/>
+        <w:bidi w:val="0"/>
+        <w:spacing w:lineRule="auto" w:line="276" w:before="0" w:after="0"/>
         <w:ind w:hanging="0" w:left="180" w:right="0"/>
         <w:jc w:val="both"/>
         <w:rPr/>
@@ -1453,31 +1647,11 @@
         <w:rPr>
           <w:b/>
           <w:bCs/>
-          <w:i/>
-          <w:color w:val="CD5937"/>
-          <w:shd w:fill="FFFFFF" w:val="clear"/>
-        </w:rPr>
-        <w:t>your 1st day of the next working month from the deployment date based on your performance</w:t>
-      </w:r>
-      <w:r>
-        <w:rPr>
-          <w:b/>
-          <w:bCs/>
-          <w:i/>
           <w:color w:themeColor="dark1" w:val="000000"/>
           <w:shd w:fill="FFFFFF" w:val="clear"/>
         </w:rPr>
-        <w:t>.</w:t>
-      </w:r>
-      <w:r>
-        <w:rPr>
-          <w:b/>
-          <w:bCs/>
-          <w:color w:themeColor="dark1" w:val="000000"/>
-          <w:shd w:fill="FFFFFF" w:val="clear"/>
-        </w:rPr>
-        <w:t> </w:t>
         <w:br/>
+        <w:t xml:space="preserve"> </w:t>
       </w:r>
       <w:r>
         <w:rPr/>
@@ -4432,9 +4606,9 @@
         </w:tblCellMar>
       </w:tblPr>
       <w:tblGrid>
-        <w:gridCol w:w="5209"/>
+        <w:gridCol w:w="5208"/>
         <w:gridCol w:w="2336"/>
-        <w:gridCol w:w="2213"/>
+        <w:gridCol w:w="2214"/>
       </w:tblGrid>
       <w:tr>
         <w:trPr>
@@ -4442,7 +4616,7 @@
         </w:trPr>
         <w:tc>
           <w:tcPr>
-            <w:tcW w:w="5209" w:type="dxa"/>
+            <w:tcW w:w="5208" w:type="dxa"/>
             <w:tcBorders>
               <w:top w:val="single" w:sz="4" w:space="0" w:color="000000"/>
               <w:left w:val="single" w:sz="4" w:space="0" w:color="000000"/>
@@ -4508,7 +4682,7 @@
         </w:tc>
         <w:tc>
           <w:tcPr>
-            <w:tcW w:w="2213" w:type="dxa"/>
+            <w:tcW w:w="2214" w:type="dxa"/>
             <w:tcBorders>
               <w:top w:val="single" w:sz="4" w:space="0" w:color="000000"/>
               <w:left w:val="single" w:sz="4" w:space="0" w:color="000000"/>
@@ -4546,7 +4720,7 @@
         </w:trPr>
         <w:tc>
           <w:tcPr>
-            <w:tcW w:w="5209" w:type="dxa"/>
+            <w:tcW w:w="5208" w:type="dxa"/>
             <w:tcBorders>
               <w:top w:val="single" w:sz="4" w:space="0" w:color="000000"/>
               <w:left w:val="single" w:sz="4" w:space="0" w:color="000000"/>
@@ -4653,7 +4827,7 @@
         </w:tc>
         <w:tc>
           <w:tcPr>
-            <w:tcW w:w="2213" w:type="dxa"/>
+            <w:tcW w:w="2214" w:type="dxa"/>
             <w:tcBorders>
               <w:top w:val="single" w:sz="4" w:space="0" w:color="000000"/>
               <w:left w:val="single" w:sz="4" w:space="0" w:color="000000"/>
@@ -4688,7 +4862,7 @@
         </w:trPr>
         <w:tc>
           <w:tcPr>
-            <w:tcW w:w="5209" w:type="dxa"/>
+            <w:tcW w:w="5208" w:type="dxa"/>
             <w:tcBorders>
               <w:top w:val="single" w:sz="4" w:space="0" w:color="000000"/>
               <w:left w:val="single" w:sz="4" w:space="0" w:color="000000"/>
@@ -4764,7 +4938,7 @@
         </w:tc>
         <w:tc>
           <w:tcPr>
-            <w:tcW w:w="2213" w:type="dxa"/>
+            <w:tcW w:w="2214" w:type="dxa"/>
             <w:tcBorders>
               <w:top w:val="single" w:sz="4" w:space="0" w:color="000000"/>
               <w:left w:val="single" w:sz="4" w:space="0" w:color="000000"/>
@@ -4799,7 +4973,7 @@
         </w:trPr>
         <w:tc>
           <w:tcPr>
-            <w:tcW w:w="5209" w:type="dxa"/>
+            <w:tcW w:w="5208" w:type="dxa"/>
             <w:tcBorders>
               <w:top w:val="single" w:sz="4" w:space="0" w:color="000000"/>
               <w:left w:val="single" w:sz="4" w:space="0" w:color="000000"/>
@@ -4906,7 +5080,7 @@
         </w:tc>
         <w:tc>
           <w:tcPr>
-            <w:tcW w:w="2213" w:type="dxa"/>
+            <w:tcW w:w="2214" w:type="dxa"/>
             <w:tcBorders>
               <w:top w:val="single" w:sz="4" w:space="0" w:color="000000"/>
               <w:left w:val="single" w:sz="4" w:space="0" w:color="000000"/>
@@ -4941,7 +5115,7 @@
         </w:trPr>
         <w:tc>
           <w:tcPr>
-            <w:tcW w:w="5209" w:type="dxa"/>
+            <w:tcW w:w="5208" w:type="dxa"/>
             <w:tcBorders>
               <w:top w:val="single" w:sz="4" w:space="0" w:color="000000"/>
               <w:left w:val="single" w:sz="4" w:space="0" w:color="000000"/>
@@ -5017,7 +5191,7 @@
         </w:tc>
         <w:tc>
           <w:tcPr>
-            <w:tcW w:w="2213" w:type="dxa"/>
+            <w:tcW w:w="2214" w:type="dxa"/>
             <w:tcBorders>
               <w:top w:val="single" w:sz="4" w:space="0" w:color="000000"/>
               <w:left w:val="single" w:sz="4" w:space="0" w:color="000000"/>
@@ -5052,7 +5226,7 @@
         </w:trPr>
         <w:tc>
           <w:tcPr>
-            <w:tcW w:w="5209" w:type="dxa"/>
+            <w:tcW w:w="5208" w:type="dxa"/>
             <w:tcBorders>
               <w:top w:val="single" w:sz="4" w:space="0" w:color="000000"/>
               <w:left w:val="single" w:sz="4" w:space="0" w:color="000000"/>
@@ -5190,7 +5364,7 @@
         </w:tc>
         <w:tc>
           <w:tcPr>
-            <w:tcW w:w="2213" w:type="dxa"/>
+            <w:tcW w:w="2214" w:type="dxa"/>
             <w:tcBorders>
               <w:top w:val="single" w:sz="4" w:space="0" w:color="000000"/>
               <w:left w:val="single" w:sz="4" w:space="0" w:color="000000"/>
@@ -5225,7 +5399,7 @@
         </w:trPr>
         <w:tc>
           <w:tcPr>
-            <w:tcW w:w="5209" w:type="dxa"/>
+            <w:tcW w:w="5208" w:type="dxa"/>
             <w:tcBorders>
               <w:top w:val="single" w:sz="4" w:space="0" w:color="000000"/>
               <w:left w:val="single" w:sz="4" w:space="0" w:color="000000"/>
@@ -5363,7 +5537,7 @@
         </w:tc>
         <w:tc>
           <w:tcPr>
-            <w:tcW w:w="2213" w:type="dxa"/>
+            <w:tcW w:w="2214" w:type="dxa"/>
             <w:tcBorders>
               <w:top w:val="single" w:sz="4" w:space="0" w:color="000000"/>
               <w:left w:val="single" w:sz="4" w:space="0" w:color="000000"/>
@@ -5398,7 +5572,7 @@
         </w:trPr>
         <w:tc>
           <w:tcPr>
-            <w:tcW w:w="5209" w:type="dxa"/>
+            <w:tcW w:w="5208" w:type="dxa"/>
             <w:tcBorders>
               <w:top w:val="single" w:sz="4" w:space="0" w:color="000000"/>
               <w:left w:val="single" w:sz="4" w:space="0" w:color="000000"/>
@@ -5505,7 +5679,7 @@
         </w:tc>
         <w:tc>
           <w:tcPr>
-            <w:tcW w:w="2213" w:type="dxa"/>
+            <w:tcW w:w="2214" w:type="dxa"/>
             <w:tcBorders>
               <w:top w:val="single" w:sz="4" w:space="0" w:color="000000"/>
               <w:left w:val="single" w:sz="4" w:space="0" w:color="000000"/>
@@ -5540,7 +5714,7 @@
         </w:trPr>
         <w:tc>
           <w:tcPr>
-            <w:tcW w:w="5209" w:type="dxa"/>
+            <w:tcW w:w="5208" w:type="dxa"/>
             <w:tcBorders>
               <w:top w:val="single" w:sz="4" w:space="0" w:color="000000"/>
               <w:left w:val="single" w:sz="4" w:space="0" w:color="000000"/>
@@ -5647,7 +5821,7 @@
         </w:tc>
         <w:tc>
           <w:tcPr>
-            <w:tcW w:w="2213" w:type="dxa"/>
+            <w:tcW w:w="2214" w:type="dxa"/>
             <w:tcBorders>
               <w:top w:val="single" w:sz="4" w:space="0" w:color="000000"/>
               <w:left w:val="single" w:sz="4" w:space="0" w:color="000000"/>
@@ -5682,7 +5856,7 @@
         </w:trPr>
         <w:tc>
           <w:tcPr>
-            <w:tcW w:w="5209" w:type="dxa"/>
+            <w:tcW w:w="5208" w:type="dxa"/>
             <w:tcBorders>
               <w:top w:val="single" w:sz="4" w:space="0" w:color="000000"/>
               <w:left w:val="single" w:sz="4" w:space="0" w:color="000000"/>
@@ -5851,7 +6025,7 @@
         </w:tc>
         <w:tc>
           <w:tcPr>
-            <w:tcW w:w="2213" w:type="dxa"/>
+            <w:tcW w:w="2214" w:type="dxa"/>
             <w:tcBorders>
               <w:top w:val="single" w:sz="4" w:space="0" w:color="000000"/>
               <w:left w:val="single" w:sz="4" w:space="0" w:color="000000"/>
@@ -5886,7 +6060,7 @@
         </w:trPr>
         <w:tc>
           <w:tcPr>
-            <w:tcW w:w="5209" w:type="dxa"/>
+            <w:tcW w:w="5208" w:type="dxa"/>
             <w:tcBorders>
               <w:top w:val="single" w:sz="4" w:space="0" w:color="000000"/>
               <w:left w:val="single" w:sz="4" w:space="0" w:color="000000"/>
@@ -5964,7 +6138,7 @@
         </w:tc>
         <w:tc>
           <w:tcPr>
-            <w:tcW w:w="2213" w:type="dxa"/>
+            <w:tcW w:w="2214" w:type="dxa"/>
             <w:tcBorders>
               <w:top w:val="single" w:sz="4" w:space="0" w:color="000000"/>
               <w:left w:val="single" w:sz="4" w:space="0" w:color="000000"/>
@@ -7422,8 +7596,8 @@
       </w:tblPr>
       <w:tblGrid>
         <w:gridCol w:w="5211"/>
-        <w:gridCol w:w="2729"/>
-        <w:gridCol w:w="2260"/>
+        <w:gridCol w:w="2728"/>
+        <w:gridCol w:w="2261"/>
       </w:tblGrid>
       <w:tr>
         <w:trPr>
@@ -7464,7 +7638,7 @@
         </w:tc>
         <w:tc>
           <w:tcPr>
-            <w:tcW w:w="2729" w:type="dxa"/>
+            <w:tcW w:w="2728" w:type="dxa"/>
             <w:tcBorders>
               <w:top w:val="single" w:sz="4" w:space="0" w:color="000000"/>
               <w:left w:val="single" w:sz="4" w:space="0" w:color="000000"/>
@@ -7497,7 +7671,7 @@
         </w:tc>
         <w:tc>
           <w:tcPr>
-            <w:tcW w:w="2260" w:type="dxa"/>
+            <w:tcW w:w="2261" w:type="dxa"/>
             <w:tcBorders>
               <w:top w:val="single" w:sz="4" w:space="0" w:color="000000"/>
               <w:left w:val="single" w:sz="4" w:space="0" w:color="000000"/>
@@ -7612,7 +7786,7 @@
         </w:tc>
         <w:tc>
           <w:tcPr>
-            <w:tcW w:w="2729" w:type="dxa"/>
+            <w:tcW w:w="2728" w:type="dxa"/>
             <w:tcBorders>
               <w:top w:val="single" w:sz="4" w:space="0" w:color="000000"/>
               <w:left w:val="single" w:sz="4" w:space="0" w:color="000000"/>
@@ -7642,7 +7816,7 @@
         </w:tc>
         <w:tc>
           <w:tcPr>
-            <w:tcW w:w="2260" w:type="dxa"/>
+            <w:tcW w:w="2261" w:type="dxa"/>
             <w:tcBorders>
               <w:top w:val="single" w:sz="4" w:space="0" w:color="000000"/>
               <w:left w:val="single" w:sz="4" w:space="0" w:color="000000"/>
@@ -7723,7 +7897,7 @@
         </w:tc>
         <w:tc>
           <w:tcPr>
-            <w:tcW w:w="2729" w:type="dxa"/>
+            <w:tcW w:w="2728" w:type="dxa"/>
             <w:tcBorders>
               <w:top w:val="single" w:sz="4" w:space="0" w:color="000000"/>
               <w:left w:val="single" w:sz="4" w:space="0" w:color="000000"/>
@@ -7753,7 +7927,7 @@
         </w:tc>
         <w:tc>
           <w:tcPr>
-            <w:tcW w:w="2260" w:type="dxa"/>
+            <w:tcW w:w="2261" w:type="dxa"/>
             <w:tcBorders>
               <w:top w:val="single" w:sz="4" w:space="0" w:color="000000"/>
               <w:left w:val="single" w:sz="4" w:space="0" w:color="000000"/>
@@ -7865,7 +8039,7 @@
         </w:tc>
         <w:tc>
           <w:tcPr>
-            <w:tcW w:w="2729" w:type="dxa"/>
+            <w:tcW w:w="2728" w:type="dxa"/>
             <w:tcBorders>
               <w:top w:val="single" w:sz="4" w:space="0" w:color="000000"/>
               <w:left w:val="single" w:sz="4" w:space="0" w:color="000000"/>
@@ -7895,7 +8069,7 @@
         </w:tc>
         <w:tc>
           <w:tcPr>
-            <w:tcW w:w="2260" w:type="dxa"/>
+            <w:tcW w:w="2261" w:type="dxa"/>
             <w:tcBorders>
               <w:top w:val="single" w:sz="4" w:space="0" w:color="000000"/>
               <w:left w:val="single" w:sz="4" w:space="0" w:color="000000"/>
@@ -7976,7 +8150,7 @@
         </w:tc>
         <w:tc>
           <w:tcPr>
-            <w:tcW w:w="2729" w:type="dxa"/>
+            <w:tcW w:w="2728" w:type="dxa"/>
             <w:tcBorders>
               <w:top w:val="single" w:sz="4" w:space="0" w:color="000000"/>
               <w:left w:val="single" w:sz="4" w:space="0" w:color="000000"/>
@@ -8006,7 +8180,7 @@
         </w:tc>
         <w:tc>
           <w:tcPr>
-            <w:tcW w:w="2260" w:type="dxa"/>
+            <w:tcW w:w="2261" w:type="dxa"/>
             <w:tcBorders>
               <w:top w:val="single" w:sz="4" w:space="0" w:color="000000"/>
               <w:left w:val="single" w:sz="4" w:space="0" w:color="000000"/>
@@ -8149,7 +8323,7 @@
         </w:tc>
         <w:tc>
           <w:tcPr>
-            <w:tcW w:w="2729" w:type="dxa"/>
+            <w:tcW w:w="2728" w:type="dxa"/>
             <w:tcBorders>
               <w:top w:val="single" w:sz="4" w:space="0" w:color="000000"/>
               <w:left w:val="single" w:sz="4" w:space="0" w:color="000000"/>
@@ -8179,7 +8353,7 @@
         </w:tc>
         <w:tc>
           <w:tcPr>
-            <w:tcW w:w="2260" w:type="dxa"/>
+            <w:tcW w:w="2261" w:type="dxa"/>
             <w:tcBorders>
               <w:top w:val="single" w:sz="4" w:space="0" w:color="000000"/>
               <w:left w:val="single" w:sz="4" w:space="0" w:color="000000"/>
@@ -8322,7 +8496,7 @@
         </w:tc>
         <w:tc>
           <w:tcPr>
-            <w:tcW w:w="2729" w:type="dxa"/>
+            <w:tcW w:w="2728" w:type="dxa"/>
             <w:tcBorders>
               <w:top w:val="single" w:sz="4" w:space="0" w:color="000000"/>
               <w:left w:val="single" w:sz="4" w:space="0" w:color="000000"/>
@@ -8352,7 +8526,7 @@
         </w:tc>
         <w:tc>
           <w:tcPr>
-            <w:tcW w:w="2260" w:type="dxa"/>
+            <w:tcW w:w="2261" w:type="dxa"/>
             <w:tcBorders>
               <w:top w:val="single" w:sz="4" w:space="0" w:color="000000"/>
               <w:left w:val="single" w:sz="4" w:space="0" w:color="000000"/>
@@ -8464,7 +8638,7 @@
         </w:tc>
         <w:tc>
           <w:tcPr>
-            <w:tcW w:w="2729" w:type="dxa"/>
+            <w:tcW w:w="2728" w:type="dxa"/>
             <w:tcBorders>
               <w:top w:val="single" w:sz="4" w:space="0" w:color="000000"/>
               <w:left w:val="single" w:sz="4" w:space="0" w:color="000000"/>
@@ -8494,7 +8668,7 @@
         </w:tc>
         <w:tc>
           <w:tcPr>
-            <w:tcW w:w="2260" w:type="dxa"/>
+            <w:tcW w:w="2261" w:type="dxa"/>
             <w:tcBorders>
               <w:top w:val="single" w:sz="4" w:space="0" w:color="000000"/>
               <w:left w:val="single" w:sz="4" w:space="0" w:color="000000"/>
@@ -8606,7 +8780,7 @@
         </w:tc>
         <w:tc>
           <w:tcPr>
-            <w:tcW w:w="2729" w:type="dxa"/>
+            <w:tcW w:w="2728" w:type="dxa"/>
             <w:tcBorders>
               <w:top w:val="single" w:sz="4" w:space="0" w:color="000000"/>
               <w:left w:val="single" w:sz="4" w:space="0" w:color="000000"/>
@@ -8636,7 +8810,7 @@
         </w:tc>
         <w:tc>
           <w:tcPr>
-            <w:tcW w:w="2260" w:type="dxa"/>
+            <w:tcW w:w="2261" w:type="dxa"/>
             <w:tcBorders>
               <w:top w:val="single" w:sz="4" w:space="0" w:color="000000"/>
               <w:left w:val="single" w:sz="4" w:space="0" w:color="000000"/>
@@ -8810,7 +8984,7 @@
         </w:tc>
         <w:tc>
           <w:tcPr>
-            <w:tcW w:w="2729" w:type="dxa"/>
+            <w:tcW w:w="2728" w:type="dxa"/>
             <w:tcBorders>
               <w:top w:val="single" w:sz="4" w:space="0" w:color="000000"/>
               <w:left w:val="single" w:sz="4" w:space="0" w:color="000000"/>
@@ -8840,7 +9014,7 @@
         </w:tc>
         <w:tc>
           <w:tcPr>
-            <w:tcW w:w="2260" w:type="dxa"/>
+            <w:tcW w:w="2261" w:type="dxa"/>
             <w:tcBorders>
               <w:top w:val="single" w:sz="4" w:space="0" w:color="000000"/>
               <w:left w:val="single" w:sz="4" w:space="0" w:color="000000"/>
@@ -8922,7 +9096,7 @@
         </w:tc>
         <w:tc>
           <w:tcPr>
-            <w:tcW w:w="2729" w:type="dxa"/>
+            <w:tcW w:w="2728" w:type="dxa"/>
             <w:tcBorders>
               <w:top w:val="single" w:sz="4" w:space="0" w:color="000000"/>
               <w:left w:val="single" w:sz="4" w:space="0" w:color="000000"/>
@@ -8953,7 +9127,7 @@
         </w:tc>
         <w:tc>
           <w:tcPr>
-            <w:tcW w:w="2260" w:type="dxa"/>
+            <w:tcW w:w="2261" w:type="dxa"/>
             <w:tcBorders>
               <w:top w:val="single" w:sz="4" w:space="0" w:color="000000"/>
               <w:left w:val="single" w:sz="4" w:space="0" w:color="000000"/>
@@ -10719,7 +10893,7 @@
         <w:vertAlign w:val="baseline"/>
       </w:rPr>
       <w:drawing>
-        <wp:anchor distT="0" distB="0" distL="0" distR="0" simplePos="0" relativeHeight="14" behindDoc="1" locked="0" layoutInCell="1" allowOverlap="1">
+        <wp:anchor distT="0" distB="0" distL="0" distR="0" simplePos="0" relativeHeight="11" behindDoc="1" locked="0" layoutInCell="1" allowOverlap="1">
           <wp:simplePos x="0" y="0"/>
           <wp:positionH relativeFrom="column">
             <wp:posOffset>-132715</wp:posOffset>
@@ -10911,7 +11085,7 @@
         <w:vertAlign w:val="baseline"/>
       </w:rPr>
       <w:drawing>
-        <wp:anchor distT="0" distB="0" distL="0" distR="0" simplePos="0" relativeHeight="14" behindDoc="1" locked="0" layoutInCell="1" allowOverlap="1">
+        <wp:anchor distT="0" distB="0" distL="0" distR="0" simplePos="0" relativeHeight="11" behindDoc="1" locked="0" layoutInCell="1" allowOverlap="1">
           <wp:simplePos x="0" y="0"/>
           <wp:positionH relativeFrom="column">
             <wp:posOffset>-132715</wp:posOffset>
@@ -12167,7 +12341,7 @@
         <w:vertAlign w:val="baseline"/>
       </w:rPr>
       <w:drawing>
-        <wp:anchor distT="0" distB="0" distL="0" distR="0" simplePos="0" relativeHeight="10" behindDoc="1" locked="0" layoutInCell="1" allowOverlap="1">
+        <wp:anchor distT="0" distB="0" distL="0" distR="0" simplePos="0" relativeHeight="3" behindDoc="1" locked="0" layoutInCell="1" allowOverlap="1">
           <wp:simplePos x="0" y="0"/>
           <wp:positionH relativeFrom="column">
             <wp:posOffset>-31750</wp:posOffset>
@@ -12269,7 +12443,7 @@
         <w:vertAlign w:val="baseline"/>
       </w:rPr>
       <w:drawing>
-        <wp:anchor distT="0" distB="0" distL="0" distR="0" simplePos="0" relativeHeight="10" behindDoc="1" locked="0" layoutInCell="1" allowOverlap="1">
+        <wp:anchor distT="0" distB="0" distL="0" distR="0" simplePos="0" relativeHeight="3" behindDoc="1" locked="0" layoutInCell="1" allowOverlap="1">
           <wp:simplePos x="0" y="0"/>
           <wp:positionH relativeFrom="column">
             <wp:posOffset>-31750</wp:posOffset>
@@ -13957,8 +14131,8 @@
       <w:bCs/>
     </w:rPr>
   </w:style>
-  <w:style w:type="character" w:styleId="Bullets">
-    <w:name w:val="Bullets"/>
+  <w:style w:type="character" w:styleId="Bulletsuser">
+    <w:name w:val="Bullets (user)"/>
     <w:qFormat/>
     <w:rPr>
       <w:rFonts w:ascii="OpenSymbol" w:hAnsi="OpenSymbol" w:eastAsia="OpenSymbol" w:cs="OpenSymbol"/>

</xml_diff>

<commit_message>
storing files path in db
</commit_message>
<xml_diff>
--- a/backend/template.docx
+++ b/backend/template.docx
@@ -2382,7 +2382,7 @@
           <w:shd w:fill="FFFFFF" w:val="clear"/>
           <w:lang w:val="en-US"/>
         </w:rPr>
-        <w:t>You will be paid “Notice Period Buyout” amount upto  INR</w:t>
+        <w:t xml:space="preserve">You will be paid “Notice Period Buyout” amount upto  INR </w:t>
       </w:r>
       <w:r>
         <w:rPr>
@@ -2696,43 +2696,7 @@
           <w:shd w:fill="FFFFFF" w:val="clear"/>
           <w:lang w:val="en-US"/>
         </w:rPr>
-        <w:t>{{Relocation_</w:t>
-      </w:r>
-      <w:r>
-        <w:rPr>
-          <w:rFonts w:cs="Calibri"/>
-          <w:b/>
-          <w:bCs/>
-          <w:i w:val="false"/>
-          <w:iCs w:val="false"/>
-          <w:caps w:val="false"/>
-          <w:smallCaps w:val="false"/>
-          <w:color w:themeColor="dark1" w:val="000000"/>
-          <w:spacing w:val="0"/>
-          <w:sz w:val="22"/>
-          <w:szCs w:val="22"/>
-          <w:shd w:fill="FFFFFF" w:val="clear"/>
-          <w:lang w:val="en-US"/>
-        </w:rPr>
-        <w:t>From</w:t>
-      </w:r>
-      <w:r>
-        <w:rPr>
-          <w:rFonts w:cs="Calibri"/>
-          <w:b/>
-          <w:bCs/>
-          <w:i w:val="false"/>
-          <w:iCs w:val="false"/>
-          <w:caps w:val="false"/>
-          <w:smallCaps w:val="false"/>
-          <w:color w:themeColor="dark1" w:val="000000"/>
-          <w:spacing w:val="0"/>
-          <w:sz w:val="22"/>
-          <w:szCs w:val="22"/>
-          <w:shd w:fill="FFFFFF" w:val="clear"/>
-          <w:lang w:val="en-US"/>
-        </w:rPr>
-        <w:t xml:space="preserve">}} </w:t>
+        <w:t xml:space="preserve">{{Relocation_From}} </w:t>
       </w:r>
       <w:r>
         <w:rPr>
@@ -4747,9 +4711,9 @@
         </w:tblCellMar>
       </w:tblPr>
       <w:tblGrid>
-        <w:gridCol w:w="5207"/>
+        <w:gridCol w:w="5206"/>
         <w:gridCol w:w="2336"/>
-        <w:gridCol w:w="2215"/>
+        <w:gridCol w:w="2216"/>
       </w:tblGrid>
       <w:tr>
         <w:trPr>
@@ -4757,7 +4721,7 @@
         </w:trPr>
         <w:tc>
           <w:tcPr>
-            <w:tcW w:w="5207" w:type="dxa"/>
+            <w:tcW w:w="5206" w:type="dxa"/>
             <w:tcBorders>
               <w:top w:val="single" w:sz="4" w:space="0" w:color="000000"/>
               <w:left w:val="single" w:sz="4" w:space="0" w:color="000000"/>
@@ -4823,7 +4787,7 @@
         </w:tc>
         <w:tc>
           <w:tcPr>
-            <w:tcW w:w="2215" w:type="dxa"/>
+            <w:tcW w:w="2216" w:type="dxa"/>
             <w:tcBorders>
               <w:top w:val="single" w:sz="4" w:space="0" w:color="000000"/>
               <w:left w:val="single" w:sz="4" w:space="0" w:color="000000"/>
@@ -4861,7 +4825,7 @@
         </w:trPr>
         <w:tc>
           <w:tcPr>
-            <w:tcW w:w="5207" w:type="dxa"/>
+            <w:tcW w:w="5206" w:type="dxa"/>
             <w:tcBorders>
               <w:top w:val="single" w:sz="4" w:space="0" w:color="000000"/>
               <w:left w:val="single" w:sz="4" w:space="0" w:color="000000"/>
@@ -4968,7 +4932,7 @@
         </w:tc>
         <w:tc>
           <w:tcPr>
-            <w:tcW w:w="2215" w:type="dxa"/>
+            <w:tcW w:w="2216" w:type="dxa"/>
             <w:tcBorders>
               <w:top w:val="single" w:sz="4" w:space="0" w:color="000000"/>
               <w:left w:val="single" w:sz="4" w:space="0" w:color="000000"/>
@@ -5003,7 +4967,7 @@
         </w:trPr>
         <w:tc>
           <w:tcPr>
-            <w:tcW w:w="5207" w:type="dxa"/>
+            <w:tcW w:w="5206" w:type="dxa"/>
             <w:tcBorders>
               <w:top w:val="single" w:sz="4" w:space="0" w:color="000000"/>
               <w:left w:val="single" w:sz="4" w:space="0" w:color="000000"/>
@@ -5079,7 +5043,7 @@
         </w:tc>
         <w:tc>
           <w:tcPr>
-            <w:tcW w:w="2215" w:type="dxa"/>
+            <w:tcW w:w="2216" w:type="dxa"/>
             <w:tcBorders>
               <w:top w:val="single" w:sz="4" w:space="0" w:color="000000"/>
               <w:left w:val="single" w:sz="4" w:space="0" w:color="000000"/>
@@ -5114,7 +5078,7 @@
         </w:trPr>
         <w:tc>
           <w:tcPr>
-            <w:tcW w:w="5207" w:type="dxa"/>
+            <w:tcW w:w="5206" w:type="dxa"/>
             <w:tcBorders>
               <w:top w:val="single" w:sz="4" w:space="0" w:color="000000"/>
               <w:left w:val="single" w:sz="4" w:space="0" w:color="000000"/>
@@ -5221,7 +5185,7 @@
         </w:tc>
         <w:tc>
           <w:tcPr>
-            <w:tcW w:w="2215" w:type="dxa"/>
+            <w:tcW w:w="2216" w:type="dxa"/>
             <w:tcBorders>
               <w:top w:val="single" w:sz="4" w:space="0" w:color="000000"/>
               <w:left w:val="single" w:sz="4" w:space="0" w:color="000000"/>
@@ -5256,7 +5220,7 @@
         </w:trPr>
         <w:tc>
           <w:tcPr>
-            <w:tcW w:w="5207" w:type="dxa"/>
+            <w:tcW w:w="5206" w:type="dxa"/>
             <w:tcBorders>
               <w:top w:val="single" w:sz="4" w:space="0" w:color="000000"/>
               <w:left w:val="single" w:sz="4" w:space="0" w:color="000000"/>
@@ -5332,7 +5296,7 @@
         </w:tc>
         <w:tc>
           <w:tcPr>
-            <w:tcW w:w="2215" w:type="dxa"/>
+            <w:tcW w:w="2216" w:type="dxa"/>
             <w:tcBorders>
               <w:top w:val="single" w:sz="4" w:space="0" w:color="000000"/>
               <w:left w:val="single" w:sz="4" w:space="0" w:color="000000"/>
@@ -5367,7 +5331,7 @@
         </w:trPr>
         <w:tc>
           <w:tcPr>
-            <w:tcW w:w="5207" w:type="dxa"/>
+            <w:tcW w:w="5206" w:type="dxa"/>
             <w:tcBorders>
               <w:top w:val="single" w:sz="4" w:space="0" w:color="000000"/>
               <w:left w:val="single" w:sz="4" w:space="0" w:color="000000"/>
@@ -5505,7 +5469,7 @@
         </w:tc>
         <w:tc>
           <w:tcPr>
-            <w:tcW w:w="2215" w:type="dxa"/>
+            <w:tcW w:w="2216" w:type="dxa"/>
             <w:tcBorders>
               <w:top w:val="single" w:sz="4" w:space="0" w:color="000000"/>
               <w:left w:val="single" w:sz="4" w:space="0" w:color="000000"/>
@@ -5540,7 +5504,7 @@
         </w:trPr>
         <w:tc>
           <w:tcPr>
-            <w:tcW w:w="5207" w:type="dxa"/>
+            <w:tcW w:w="5206" w:type="dxa"/>
             <w:tcBorders>
               <w:top w:val="single" w:sz="4" w:space="0" w:color="000000"/>
               <w:left w:val="single" w:sz="4" w:space="0" w:color="000000"/>
@@ -5678,7 +5642,7 @@
         </w:tc>
         <w:tc>
           <w:tcPr>
-            <w:tcW w:w="2215" w:type="dxa"/>
+            <w:tcW w:w="2216" w:type="dxa"/>
             <w:tcBorders>
               <w:top w:val="single" w:sz="4" w:space="0" w:color="000000"/>
               <w:left w:val="single" w:sz="4" w:space="0" w:color="000000"/>
@@ -5713,7 +5677,7 @@
         </w:trPr>
         <w:tc>
           <w:tcPr>
-            <w:tcW w:w="5207" w:type="dxa"/>
+            <w:tcW w:w="5206" w:type="dxa"/>
             <w:tcBorders>
               <w:top w:val="single" w:sz="4" w:space="0" w:color="000000"/>
               <w:left w:val="single" w:sz="4" w:space="0" w:color="000000"/>
@@ -5820,7 +5784,7 @@
         </w:tc>
         <w:tc>
           <w:tcPr>
-            <w:tcW w:w="2215" w:type="dxa"/>
+            <w:tcW w:w="2216" w:type="dxa"/>
             <w:tcBorders>
               <w:top w:val="single" w:sz="4" w:space="0" w:color="000000"/>
               <w:left w:val="single" w:sz="4" w:space="0" w:color="000000"/>
@@ -5855,7 +5819,7 @@
         </w:trPr>
         <w:tc>
           <w:tcPr>
-            <w:tcW w:w="5207" w:type="dxa"/>
+            <w:tcW w:w="5206" w:type="dxa"/>
             <w:tcBorders>
               <w:top w:val="single" w:sz="4" w:space="0" w:color="000000"/>
               <w:left w:val="single" w:sz="4" w:space="0" w:color="000000"/>
@@ -5962,7 +5926,7 @@
         </w:tc>
         <w:tc>
           <w:tcPr>
-            <w:tcW w:w="2215" w:type="dxa"/>
+            <w:tcW w:w="2216" w:type="dxa"/>
             <w:tcBorders>
               <w:top w:val="single" w:sz="4" w:space="0" w:color="000000"/>
               <w:left w:val="single" w:sz="4" w:space="0" w:color="000000"/>
@@ -5997,7 +5961,7 @@
         </w:trPr>
         <w:tc>
           <w:tcPr>
-            <w:tcW w:w="5207" w:type="dxa"/>
+            <w:tcW w:w="5206" w:type="dxa"/>
             <w:tcBorders>
               <w:top w:val="single" w:sz="4" w:space="0" w:color="000000"/>
               <w:left w:val="single" w:sz="4" w:space="0" w:color="000000"/>
@@ -6166,7 +6130,7 @@
         </w:tc>
         <w:tc>
           <w:tcPr>
-            <w:tcW w:w="2215" w:type="dxa"/>
+            <w:tcW w:w="2216" w:type="dxa"/>
             <w:tcBorders>
               <w:top w:val="single" w:sz="4" w:space="0" w:color="000000"/>
               <w:left w:val="single" w:sz="4" w:space="0" w:color="000000"/>
@@ -6201,7 +6165,7 @@
         </w:trPr>
         <w:tc>
           <w:tcPr>
-            <w:tcW w:w="5207" w:type="dxa"/>
+            <w:tcW w:w="5206" w:type="dxa"/>
             <w:tcBorders>
               <w:top w:val="single" w:sz="4" w:space="0" w:color="000000"/>
               <w:left w:val="single" w:sz="4" w:space="0" w:color="000000"/>
@@ -6279,7 +6243,7 @@
         </w:tc>
         <w:tc>
           <w:tcPr>
-            <w:tcW w:w="2215" w:type="dxa"/>
+            <w:tcW w:w="2216" w:type="dxa"/>
             <w:tcBorders>
               <w:top w:val="single" w:sz="4" w:space="0" w:color="000000"/>
               <w:left w:val="single" w:sz="4" w:space="0" w:color="000000"/>
@@ -7737,8 +7701,8 @@
       </w:tblPr>
       <w:tblGrid>
         <w:gridCol w:w="5211"/>
-        <w:gridCol w:w="2727"/>
-        <w:gridCol w:w="2262"/>
+        <w:gridCol w:w="2726"/>
+        <w:gridCol w:w="2263"/>
       </w:tblGrid>
       <w:tr>
         <w:trPr>
@@ -7779,7 +7743,7 @@
         </w:tc>
         <w:tc>
           <w:tcPr>
-            <w:tcW w:w="2727" w:type="dxa"/>
+            <w:tcW w:w="2726" w:type="dxa"/>
             <w:tcBorders>
               <w:top w:val="single" w:sz="4" w:space="0" w:color="000000"/>
               <w:left w:val="single" w:sz="4" w:space="0" w:color="000000"/>
@@ -7812,7 +7776,7 @@
         </w:tc>
         <w:tc>
           <w:tcPr>
-            <w:tcW w:w="2262" w:type="dxa"/>
+            <w:tcW w:w="2263" w:type="dxa"/>
             <w:tcBorders>
               <w:top w:val="single" w:sz="4" w:space="0" w:color="000000"/>
               <w:left w:val="single" w:sz="4" w:space="0" w:color="000000"/>
@@ -7927,7 +7891,7 @@
         </w:tc>
         <w:tc>
           <w:tcPr>
-            <w:tcW w:w="2727" w:type="dxa"/>
+            <w:tcW w:w="2726" w:type="dxa"/>
             <w:tcBorders>
               <w:top w:val="single" w:sz="4" w:space="0" w:color="000000"/>
               <w:left w:val="single" w:sz="4" w:space="0" w:color="000000"/>
@@ -7957,7 +7921,7 @@
         </w:tc>
         <w:tc>
           <w:tcPr>
-            <w:tcW w:w="2262" w:type="dxa"/>
+            <w:tcW w:w="2263" w:type="dxa"/>
             <w:tcBorders>
               <w:top w:val="single" w:sz="4" w:space="0" w:color="000000"/>
               <w:left w:val="single" w:sz="4" w:space="0" w:color="000000"/>
@@ -8038,7 +8002,7 @@
         </w:tc>
         <w:tc>
           <w:tcPr>
-            <w:tcW w:w="2727" w:type="dxa"/>
+            <w:tcW w:w="2726" w:type="dxa"/>
             <w:tcBorders>
               <w:top w:val="single" w:sz="4" w:space="0" w:color="000000"/>
               <w:left w:val="single" w:sz="4" w:space="0" w:color="000000"/>
@@ -8068,7 +8032,7 @@
         </w:tc>
         <w:tc>
           <w:tcPr>
-            <w:tcW w:w="2262" w:type="dxa"/>
+            <w:tcW w:w="2263" w:type="dxa"/>
             <w:tcBorders>
               <w:top w:val="single" w:sz="4" w:space="0" w:color="000000"/>
               <w:left w:val="single" w:sz="4" w:space="0" w:color="000000"/>
@@ -8180,7 +8144,7 @@
         </w:tc>
         <w:tc>
           <w:tcPr>
-            <w:tcW w:w="2727" w:type="dxa"/>
+            <w:tcW w:w="2726" w:type="dxa"/>
             <w:tcBorders>
               <w:top w:val="single" w:sz="4" w:space="0" w:color="000000"/>
               <w:left w:val="single" w:sz="4" w:space="0" w:color="000000"/>
@@ -8210,7 +8174,7 @@
         </w:tc>
         <w:tc>
           <w:tcPr>
-            <w:tcW w:w="2262" w:type="dxa"/>
+            <w:tcW w:w="2263" w:type="dxa"/>
             <w:tcBorders>
               <w:top w:val="single" w:sz="4" w:space="0" w:color="000000"/>
               <w:left w:val="single" w:sz="4" w:space="0" w:color="000000"/>
@@ -8291,7 +8255,7 @@
         </w:tc>
         <w:tc>
           <w:tcPr>
-            <w:tcW w:w="2727" w:type="dxa"/>
+            <w:tcW w:w="2726" w:type="dxa"/>
             <w:tcBorders>
               <w:top w:val="single" w:sz="4" w:space="0" w:color="000000"/>
               <w:left w:val="single" w:sz="4" w:space="0" w:color="000000"/>
@@ -8321,7 +8285,7 @@
         </w:tc>
         <w:tc>
           <w:tcPr>
-            <w:tcW w:w="2262" w:type="dxa"/>
+            <w:tcW w:w="2263" w:type="dxa"/>
             <w:tcBorders>
               <w:top w:val="single" w:sz="4" w:space="0" w:color="000000"/>
               <w:left w:val="single" w:sz="4" w:space="0" w:color="000000"/>
@@ -8464,7 +8428,7 @@
         </w:tc>
         <w:tc>
           <w:tcPr>
-            <w:tcW w:w="2727" w:type="dxa"/>
+            <w:tcW w:w="2726" w:type="dxa"/>
             <w:tcBorders>
               <w:top w:val="single" w:sz="4" w:space="0" w:color="000000"/>
               <w:left w:val="single" w:sz="4" w:space="0" w:color="000000"/>
@@ -8494,7 +8458,7 @@
         </w:tc>
         <w:tc>
           <w:tcPr>
-            <w:tcW w:w="2262" w:type="dxa"/>
+            <w:tcW w:w="2263" w:type="dxa"/>
             <w:tcBorders>
               <w:top w:val="single" w:sz="4" w:space="0" w:color="000000"/>
               <w:left w:val="single" w:sz="4" w:space="0" w:color="000000"/>
@@ -8637,7 +8601,7 @@
         </w:tc>
         <w:tc>
           <w:tcPr>
-            <w:tcW w:w="2727" w:type="dxa"/>
+            <w:tcW w:w="2726" w:type="dxa"/>
             <w:tcBorders>
               <w:top w:val="single" w:sz="4" w:space="0" w:color="000000"/>
               <w:left w:val="single" w:sz="4" w:space="0" w:color="000000"/>
@@ -8667,7 +8631,7 @@
         </w:tc>
         <w:tc>
           <w:tcPr>
-            <w:tcW w:w="2262" w:type="dxa"/>
+            <w:tcW w:w="2263" w:type="dxa"/>
             <w:tcBorders>
               <w:top w:val="single" w:sz="4" w:space="0" w:color="000000"/>
               <w:left w:val="single" w:sz="4" w:space="0" w:color="000000"/>
@@ -8779,7 +8743,7 @@
         </w:tc>
         <w:tc>
           <w:tcPr>
-            <w:tcW w:w="2727" w:type="dxa"/>
+            <w:tcW w:w="2726" w:type="dxa"/>
             <w:tcBorders>
               <w:top w:val="single" w:sz="4" w:space="0" w:color="000000"/>
               <w:left w:val="single" w:sz="4" w:space="0" w:color="000000"/>
@@ -8809,7 +8773,7 @@
         </w:tc>
         <w:tc>
           <w:tcPr>
-            <w:tcW w:w="2262" w:type="dxa"/>
+            <w:tcW w:w="2263" w:type="dxa"/>
             <w:tcBorders>
               <w:top w:val="single" w:sz="4" w:space="0" w:color="000000"/>
               <w:left w:val="single" w:sz="4" w:space="0" w:color="000000"/>
@@ -8921,7 +8885,7 @@
         </w:tc>
         <w:tc>
           <w:tcPr>
-            <w:tcW w:w="2727" w:type="dxa"/>
+            <w:tcW w:w="2726" w:type="dxa"/>
             <w:tcBorders>
               <w:top w:val="single" w:sz="4" w:space="0" w:color="000000"/>
               <w:left w:val="single" w:sz="4" w:space="0" w:color="000000"/>
@@ -8951,7 +8915,7 @@
         </w:tc>
         <w:tc>
           <w:tcPr>
-            <w:tcW w:w="2262" w:type="dxa"/>
+            <w:tcW w:w="2263" w:type="dxa"/>
             <w:tcBorders>
               <w:top w:val="single" w:sz="4" w:space="0" w:color="000000"/>
               <w:left w:val="single" w:sz="4" w:space="0" w:color="000000"/>
@@ -9125,7 +9089,7 @@
         </w:tc>
         <w:tc>
           <w:tcPr>
-            <w:tcW w:w="2727" w:type="dxa"/>
+            <w:tcW w:w="2726" w:type="dxa"/>
             <w:tcBorders>
               <w:top w:val="single" w:sz="4" w:space="0" w:color="000000"/>
               <w:left w:val="single" w:sz="4" w:space="0" w:color="000000"/>
@@ -9155,7 +9119,7 @@
         </w:tc>
         <w:tc>
           <w:tcPr>
-            <w:tcW w:w="2262" w:type="dxa"/>
+            <w:tcW w:w="2263" w:type="dxa"/>
             <w:tcBorders>
               <w:top w:val="single" w:sz="4" w:space="0" w:color="000000"/>
               <w:left w:val="single" w:sz="4" w:space="0" w:color="000000"/>
@@ -9237,7 +9201,7 @@
         </w:tc>
         <w:tc>
           <w:tcPr>
-            <w:tcW w:w="2727" w:type="dxa"/>
+            <w:tcW w:w="2726" w:type="dxa"/>
             <w:tcBorders>
               <w:top w:val="single" w:sz="4" w:space="0" w:color="000000"/>
               <w:left w:val="single" w:sz="4" w:space="0" w:color="000000"/>
@@ -9268,7 +9232,7 @@
         </w:tc>
         <w:tc>
           <w:tcPr>
-            <w:tcW w:w="2262" w:type="dxa"/>
+            <w:tcW w:w="2263" w:type="dxa"/>
             <w:tcBorders>
               <w:top w:val="single" w:sz="4" w:space="0" w:color="000000"/>
               <w:left w:val="single" w:sz="4" w:space="0" w:color="000000"/>
@@ -14272,8 +14236,8 @@
       <w:bCs/>
     </w:rPr>
   </w:style>
-  <w:style w:type="character" w:styleId="Bullets">
-    <w:name w:val="Bullets"/>
+  <w:style w:type="character" w:styleId="Bulletsuser">
+    <w:name w:val="Bullets (user)"/>
     <w:qFormat/>
     <w:rPr>
       <w:rFonts w:ascii="OpenSymbol" w:hAnsi="OpenSymbol" w:eastAsia="OpenSymbol" w:cs="OpenSymbol"/>

</xml_diff>

<commit_message>
access and refresh tokens fixed
</commit_message>
<xml_diff>
--- a/backend/template.docx
+++ b/backend/template.docx
@@ -1700,7 +1700,11 @@
     <w:p>
       <w:pPr>
         <w:pStyle w:val="Normal"/>
-        <w:ind w:hanging="0" w:left="141" w:right="845"/>
+        <w:widowControl w:val="false"/>
+        <w:suppressAutoHyphens w:val="true"/>
+        <w:bidi w:val="0"/>
+        <w:spacing w:before="0" w:after="0"/>
+        <w:ind w:hanging="0" w:left="180" w:right="0"/>
         <w:jc w:val="both"/>
         <w:rPr/>
       </w:pPr>
@@ -4711,9 +4715,9 @@
         </w:tblCellMar>
       </w:tblPr>
       <w:tblGrid>
-        <w:gridCol w:w="5206"/>
+        <w:gridCol w:w="5205"/>
         <w:gridCol w:w="2336"/>
-        <w:gridCol w:w="2216"/>
+        <w:gridCol w:w="2217"/>
       </w:tblGrid>
       <w:tr>
         <w:trPr>
@@ -4721,7 +4725,7 @@
         </w:trPr>
         <w:tc>
           <w:tcPr>
-            <w:tcW w:w="5206" w:type="dxa"/>
+            <w:tcW w:w="5205" w:type="dxa"/>
             <w:tcBorders>
               <w:top w:val="single" w:sz="4" w:space="0" w:color="000000"/>
               <w:left w:val="single" w:sz="4" w:space="0" w:color="000000"/>
@@ -4787,7 +4791,7 @@
         </w:tc>
         <w:tc>
           <w:tcPr>
-            <w:tcW w:w="2216" w:type="dxa"/>
+            <w:tcW w:w="2217" w:type="dxa"/>
             <w:tcBorders>
               <w:top w:val="single" w:sz="4" w:space="0" w:color="000000"/>
               <w:left w:val="single" w:sz="4" w:space="0" w:color="000000"/>
@@ -4825,7 +4829,7 @@
         </w:trPr>
         <w:tc>
           <w:tcPr>
-            <w:tcW w:w="5206" w:type="dxa"/>
+            <w:tcW w:w="5205" w:type="dxa"/>
             <w:tcBorders>
               <w:top w:val="single" w:sz="4" w:space="0" w:color="000000"/>
               <w:left w:val="single" w:sz="4" w:space="0" w:color="000000"/>
@@ -4932,7 +4936,7 @@
         </w:tc>
         <w:tc>
           <w:tcPr>
-            <w:tcW w:w="2216" w:type="dxa"/>
+            <w:tcW w:w="2217" w:type="dxa"/>
             <w:tcBorders>
               <w:top w:val="single" w:sz="4" w:space="0" w:color="000000"/>
               <w:left w:val="single" w:sz="4" w:space="0" w:color="000000"/>
@@ -4967,7 +4971,7 @@
         </w:trPr>
         <w:tc>
           <w:tcPr>
-            <w:tcW w:w="5206" w:type="dxa"/>
+            <w:tcW w:w="5205" w:type="dxa"/>
             <w:tcBorders>
               <w:top w:val="single" w:sz="4" w:space="0" w:color="000000"/>
               <w:left w:val="single" w:sz="4" w:space="0" w:color="000000"/>
@@ -5043,7 +5047,7 @@
         </w:tc>
         <w:tc>
           <w:tcPr>
-            <w:tcW w:w="2216" w:type="dxa"/>
+            <w:tcW w:w="2217" w:type="dxa"/>
             <w:tcBorders>
               <w:top w:val="single" w:sz="4" w:space="0" w:color="000000"/>
               <w:left w:val="single" w:sz="4" w:space="0" w:color="000000"/>
@@ -5078,7 +5082,7 @@
         </w:trPr>
         <w:tc>
           <w:tcPr>
-            <w:tcW w:w="5206" w:type="dxa"/>
+            <w:tcW w:w="5205" w:type="dxa"/>
             <w:tcBorders>
               <w:top w:val="single" w:sz="4" w:space="0" w:color="000000"/>
               <w:left w:val="single" w:sz="4" w:space="0" w:color="000000"/>
@@ -5185,7 +5189,7 @@
         </w:tc>
         <w:tc>
           <w:tcPr>
-            <w:tcW w:w="2216" w:type="dxa"/>
+            <w:tcW w:w="2217" w:type="dxa"/>
             <w:tcBorders>
               <w:top w:val="single" w:sz="4" w:space="0" w:color="000000"/>
               <w:left w:val="single" w:sz="4" w:space="0" w:color="000000"/>
@@ -5220,7 +5224,7 @@
         </w:trPr>
         <w:tc>
           <w:tcPr>
-            <w:tcW w:w="5206" w:type="dxa"/>
+            <w:tcW w:w="5205" w:type="dxa"/>
             <w:tcBorders>
               <w:top w:val="single" w:sz="4" w:space="0" w:color="000000"/>
               <w:left w:val="single" w:sz="4" w:space="0" w:color="000000"/>
@@ -5296,7 +5300,7 @@
         </w:tc>
         <w:tc>
           <w:tcPr>
-            <w:tcW w:w="2216" w:type="dxa"/>
+            <w:tcW w:w="2217" w:type="dxa"/>
             <w:tcBorders>
               <w:top w:val="single" w:sz="4" w:space="0" w:color="000000"/>
               <w:left w:val="single" w:sz="4" w:space="0" w:color="000000"/>
@@ -5331,7 +5335,7 @@
         </w:trPr>
         <w:tc>
           <w:tcPr>
-            <w:tcW w:w="5206" w:type="dxa"/>
+            <w:tcW w:w="5205" w:type="dxa"/>
             <w:tcBorders>
               <w:top w:val="single" w:sz="4" w:space="0" w:color="000000"/>
               <w:left w:val="single" w:sz="4" w:space="0" w:color="000000"/>
@@ -5469,7 +5473,7 @@
         </w:tc>
         <w:tc>
           <w:tcPr>
-            <w:tcW w:w="2216" w:type="dxa"/>
+            <w:tcW w:w="2217" w:type="dxa"/>
             <w:tcBorders>
               <w:top w:val="single" w:sz="4" w:space="0" w:color="000000"/>
               <w:left w:val="single" w:sz="4" w:space="0" w:color="000000"/>
@@ -5504,7 +5508,7 @@
         </w:trPr>
         <w:tc>
           <w:tcPr>
-            <w:tcW w:w="5206" w:type="dxa"/>
+            <w:tcW w:w="5205" w:type="dxa"/>
             <w:tcBorders>
               <w:top w:val="single" w:sz="4" w:space="0" w:color="000000"/>
               <w:left w:val="single" w:sz="4" w:space="0" w:color="000000"/>
@@ -5642,7 +5646,7 @@
         </w:tc>
         <w:tc>
           <w:tcPr>
-            <w:tcW w:w="2216" w:type="dxa"/>
+            <w:tcW w:w="2217" w:type="dxa"/>
             <w:tcBorders>
               <w:top w:val="single" w:sz="4" w:space="0" w:color="000000"/>
               <w:left w:val="single" w:sz="4" w:space="0" w:color="000000"/>
@@ -5677,7 +5681,7 @@
         </w:trPr>
         <w:tc>
           <w:tcPr>
-            <w:tcW w:w="5206" w:type="dxa"/>
+            <w:tcW w:w="5205" w:type="dxa"/>
             <w:tcBorders>
               <w:top w:val="single" w:sz="4" w:space="0" w:color="000000"/>
               <w:left w:val="single" w:sz="4" w:space="0" w:color="000000"/>
@@ -5784,7 +5788,7 @@
         </w:tc>
         <w:tc>
           <w:tcPr>
-            <w:tcW w:w="2216" w:type="dxa"/>
+            <w:tcW w:w="2217" w:type="dxa"/>
             <w:tcBorders>
               <w:top w:val="single" w:sz="4" w:space="0" w:color="000000"/>
               <w:left w:val="single" w:sz="4" w:space="0" w:color="000000"/>
@@ -5819,7 +5823,7 @@
         </w:trPr>
         <w:tc>
           <w:tcPr>
-            <w:tcW w:w="5206" w:type="dxa"/>
+            <w:tcW w:w="5205" w:type="dxa"/>
             <w:tcBorders>
               <w:top w:val="single" w:sz="4" w:space="0" w:color="000000"/>
               <w:left w:val="single" w:sz="4" w:space="0" w:color="000000"/>
@@ -5926,7 +5930,7 @@
         </w:tc>
         <w:tc>
           <w:tcPr>
-            <w:tcW w:w="2216" w:type="dxa"/>
+            <w:tcW w:w="2217" w:type="dxa"/>
             <w:tcBorders>
               <w:top w:val="single" w:sz="4" w:space="0" w:color="000000"/>
               <w:left w:val="single" w:sz="4" w:space="0" w:color="000000"/>
@@ -5961,7 +5965,7 @@
         </w:trPr>
         <w:tc>
           <w:tcPr>
-            <w:tcW w:w="5206" w:type="dxa"/>
+            <w:tcW w:w="5205" w:type="dxa"/>
             <w:tcBorders>
               <w:top w:val="single" w:sz="4" w:space="0" w:color="000000"/>
               <w:left w:val="single" w:sz="4" w:space="0" w:color="000000"/>
@@ -6130,7 +6134,7 @@
         </w:tc>
         <w:tc>
           <w:tcPr>
-            <w:tcW w:w="2216" w:type="dxa"/>
+            <w:tcW w:w="2217" w:type="dxa"/>
             <w:tcBorders>
               <w:top w:val="single" w:sz="4" w:space="0" w:color="000000"/>
               <w:left w:val="single" w:sz="4" w:space="0" w:color="000000"/>
@@ -6165,7 +6169,7 @@
         </w:trPr>
         <w:tc>
           <w:tcPr>
-            <w:tcW w:w="5206" w:type="dxa"/>
+            <w:tcW w:w="5205" w:type="dxa"/>
             <w:tcBorders>
               <w:top w:val="single" w:sz="4" w:space="0" w:color="000000"/>
               <w:left w:val="single" w:sz="4" w:space="0" w:color="000000"/>
@@ -6243,7 +6247,7 @@
         </w:tc>
         <w:tc>
           <w:tcPr>
-            <w:tcW w:w="2216" w:type="dxa"/>
+            <w:tcW w:w="2217" w:type="dxa"/>
             <w:tcBorders>
               <w:top w:val="single" w:sz="4" w:space="0" w:color="000000"/>
               <w:left w:val="single" w:sz="4" w:space="0" w:color="000000"/>
@@ -7701,8 +7705,8 @@
       </w:tblPr>
       <w:tblGrid>
         <w:gridCol w:w="5211"/>
-        <w:gridCol w:w="2726"/>
-        <w:gridCol w:w="2263"/>
+        <w:gridCol w:w="2725"/>
+        <w:gridCol w:w="2264"/>
       </w:tblGrid>
       <w:tr>
         <w:trPr>
@@ -7743,7 +7747,7 @@
         </w:tc>
         <w:tc>
           <w:tcPr>
-            <w:tcW w:w="2726" w:type="dxa"/>
+            <w:tcW w:w="2725" w:type="dxa"/>
             <w:tcBorders>
               <w:top w:val="single" w:sz="4" w:space="0" w:color="000000"/>
               <w:left w:val="single" w:sz="4" w:space="0" w:color="000000"/>
@@ -7776,7 +7780,7 @@
         </w:tc>
         <w:tc>
           <w:tcPr>
-            <w:tcW w:w="2263" w:type="dxa"/>
+            <w:tcW w:w="2264" w:type="dxa"/>
             <w:tcBorders>
               <w:top w:val="single" w:sz="4" w:space="0" w:color="000000"/>
               <w:left w:val="single" w:sz="4" w:space="0" w:color="000000"/>
@@ -7891,7 +7895,7 @@
         </w:tc>
         <w:tc>
           <w:tcPr>
-            <w:tcW w:w="2726" w:type="dxa"/>
+            <w:tcW w:w="2725" w:type="dxa"/>
             <w:tcBorders>
               <w:top w:val="single" w:sz="4" w:space="0" w:color="000000"/>
               <w:left w:val="single" w:sz="4" w:space="0" w:color="000000"/>
@@ -7921,7 +7925,7 @@
         </w:tc>
         <w:tc>
           <w:tcPr>
-            <w:tcW w:w="2263" w:type="dxa"/>
+            <w:tcW w:w="2264" w:type="dxa"/>
             <w:tcBorders>
               <w:top w:val="single" w:sz="4" w:space="0" w:color="000000"/>
               <w:left w:val="single" w:sz="4" w:space="0" w:color="000000"/>
@@ -8002,7 +8006,7 @@
         </w:tc>
         <w:tc>
           <w:tcPr>
-            <w:tcW w:w="2726" w:type="dxa"/>
+            <w:tcW w:w="2725" w:type="dxa"/>
             <w:tcBorders>
               <w:top w:val="single" w:sz="4" w:space="0" w:color="000000"/>
               <w:left w:val="single" w:sz="4" w:space="0" w:color="000000"/>
@@ -8032,7 +8036,7 @@
         </w:tc>
         <w:tc>
           <w:tcPr>
-            <w:tcW w:w="2263" w:type="dxa"/>
+            <w:tcW w:w="2264" w:type="dxa"/>
             <w:tcBorders>
               <w:top w:val="single" w:sz="4" w:space="0" w:color="000000"/>
               <w:left w:val="single" w:sz="4" w:space="0" w:color="000000"/>
@@ -8144,7 +8148,7 @@
         </w:tc>
         <w:tc>
           <w:tcPr>
-            <w:tcW w:w="2726" w:type="dxa"/>
+            <w:tcW w:w="2725" w:type="dxa"/>
             <w:tcBorders>
               <w:top w:val="single" w:sz="4" w:space="0" w:color="000000"/>
               <w:left w:val="single" w:sz="4" w:space="0" w:color="000000"/>
@@ -8174,7 +8178,7 @@
         </w:tc>
         <w:tc>
           <w:tcPr>
-            <w:tcW w:w="2263" w:type="dxa"/>
+            <w:tcW w:w="2264" w:type="dxa"/>
             <w:tcBorders>
               <w:top w:val="single" w:sz="4" w:space="0" w:color="000000"/>
               <w:left w:val="single" w:sz="4" w:space="0" w:color="000000"/>
@@ -8255,7 +8259,7 @@
         </w:tc>
         <w:tc>
           <w:tcPr>
-            <w:tcW w:w="2726" w:type="dxa"/>
+            <w:tcW w:w="2725" w:type="dxa"/>
             <w:tcBorders>
               <w:top w:val="single" w:sz="4" w:space="0" w:color="000000"/>
               <w:left w:val="single" w:sz="4" w:space="0" w:color="000000"/>
@@ -8285,7 +8289,7 @@
         </w:tc>
         <w:tc>
           <w:tcPr>
-            <w:tcW w:w="2263" w:type="dxa"/>
+            <w:tcW w:w="2264" w:type="dxa"/>
             <w:tcBorders>
               <w:top w:val="single" w:sz="4" w:space="0" w:color="000000"/>
               <w:left w:val="single" w:sz="4" w:space="0" w:color="000000"/>
@@ -8428,7 +8432,7 @@
         </w:tc>
         <w:tc>
           <w:tcPr>
-            <w:tcW w:w="2726" w:type="dxa"/>
+            <w:tcW w:w="2725" w:type="dxa"/>
             <w:tcBorders>
               <w:top w:val="single" w:sz="4" w:space="0" w:color="000000"/>
               <w:left w:val="single" w:sz="4" w:space="0" w:color="000000"/>
@@ -8458,7 +8462,7 @@
         </w:tc>
         <w:tc>
           <w:tcPr>
-            <w:tcW w:w="2263" w:type="dxa"/>
+            <w:tcW w:w="2264" w:type="dxa"/>
             <w:tcBorders>
               <w:top w:val="single" w:sz="4" w:space="0" w:color="000000"/>
               <w:left w:val="single" w:sz="4" w:space="0" w:color="000000"/>
@@ -8601,7 +8605,7 @@
         </w:tc>
         <w:tc>
           <w:tcPr>
-            <w:tcW w:w="2726" w:type="dxa"/>
+            <w:tcW w:w="2725" w:type="dxa"/>
             <w:tcBorders>
               <w:top w:val="single" w:sz="4" w:space="0" w:color="000000"/>
               <w:left w:val="single" w:sz="4" w:space="0" w:color="000000"/>
@@ -8631,7 +8635,7 @@
         </w:tc>
         <w:tc>
           <w:tcPr>
-            <w:tcW w:w="2263" w:type="dxa"/>
+            <w:tcW w:w="2264" w:type="dxa"/>
             <w:tcBorders>
               <w:top w:val="single" w:sz="4" w:space="0" w:color="000000"/>
               <w:left w:val="single" w:sz="4" w:space="0" w:color="000000"/>
@@ -8743,7 +8747,7 @@
         </w:tc>
         <w:tc>
           <w:tcPr>
-            <w:tcW w:w="2726" w:type="dxa"/>
+            <w:tcW w:w="2725" w:type="dxa"/>
             <w:tcBorders>
               <w:top w:val="single" w:sz="4" w:space="0" w:color="000000"/>
               <w:left w:val="single" w:sz="4" w:space="0" w:color="000000"/>
@@ -8773,7 +8777,7 @@
         </w:tc>
         <w:tc>
           <w:tcPr>
-            <w:tcW w:w="2263" w:type="dxa"/>
+            <w:tcW w:w="2264" w:type="dxa"/>
             <w:tcBorders>
               <w:top w:val="single" w:sz="4" w:space="0" w:color="000000"/>
               <w:left w:val="single" w:sz="4" w:space="0" w:color="000000"/>
@@ -8885,7 +8889,7 @@
         </w:tc>
         <w:tc>
           <w:tcPr>
-            <w:tcW w:w="2726" w:type="dxa"/>
+            <w:tcW w:w="2725" w:type="dxa"/>
             <w:tcBorders>
               <w:top w:val="single" w:sz="4" w:space="0" w:color="000000"/>
               <w:left w:val="single" w:sz="4" w:space="0" w:color="000000"/>
@@ -8915,7 +8919,7 @@
         </w:tc>
         <w:tc>
           <w:tcPr>
-            <w:tcW w:w="2263" w:type="dxa"/>
+            <w:tcW w:w="2264" w:type="dxa"/>
             <w:tcBorders>
               <w:top w:val="single" w:sz="4" w:space="0" w:color="000000"/>
               <w:left w:val="single" w:sz="4" w:space="0" w:color="000000"/>
@@ -9089,7 +9093,7 @@
         </w:tc>
         <w:tc>
           <w:tcPr>
-            <w:tcW w:w="2726" w:type="dxa"/>
+            <w:tcW w:w="2725" w:type="dxa"/>
             <w:tcBorders>
               <w:top w:val="single" w:sz="4" w:space="0" w:color="000000"/>
               <w:left w:val="single" w:sz="4" w:space="0" w:color="000000"/>
@@ -9119,7 +9123,7 @@
         </w:tc>
         <w:tc>
           <w:tcPr>
-            <w:tcW w:w="2263" w:type="dxa"/>
+            <w:tcW w:w="2264" w:type="dxa"/>
             <w:tcBorders>
               <w:top w:val="single" w:sz="4" w:space="0" w:color="000000"/>
               <w:left w:val="single" w:sz="4" w:space="0" w:color="000000"/>
@@ -9201,7 +9205,7 @@
         </w:tc>
         <w:tc>
           <w:tcPr>
-            <w:tcW w:w="2726" w:type="dxa"/>
+            <w:tcW w:w="2725" w:type="dxa"/>
             <w:tcBorders>
               <w:top w:val="single" w:sz="4" w:space="0" w:color="000000"/>
               <w:left w:val="single" w:sz="4" w:space="0" w:color="000000"/>
@@ -9232,7 +9236,7 @@
         </w:tc>
         <w:tc>
           <w:tcPr>
-            <w:tcW w:w="2263" w:type="dxa"/>
+            <w:tcW w:w="2264" w:type="dxa"/>
             <w:tcBorders>
               <w:top w:val="single" w:sz="4" w:space="0" w:color="000000"/>
               <w:left w:val="single" w:sz="4" w:space="0" w:color="000000"/>
@@ -11702,7 +11706,7 @@
         <w:vertAlign w:val="baseline"/>
       </w:rPr>
       <w:drawing>
-        <wp:anchor distT="0" distB="0" distL="0" distR="0" simplePos="0" relativeHeight="22" behindDoc="1" locked="0" layoutInCell="1" allowOverlap="1">
+        <wp:anchor distT="0" distB="0" distL="0" distR="0" simplePos="0" relativeHeight="19" behindDoc="1" locked="0" layoutInCell="1" allowOverlap="1">
           <wp:simplePos x="0" y="0"/>
           <wp:positionH relativeFrom="column">
             <wp:posOffset>-132715</wp:posOffset>
@@ -11894,7 +11898,7 @@
         <w:vertAlign w:val="baseline"/>
       </w:rPr>
       <w:drawing>
-        <wp:anchor distT="0" distB="0" distL="0" distR="0" simplePos="0" relativeHeight="22" behindDoc="1" locked="0" layoutInCell="1" allowOverlap="1">
+        <wp:anchor distT="0" distB="0" distL="0" distR="0" simplePos="0" relativeHeight="19" behindDoc="1" locked="0" layoutInCell="1" allowOverlap="1">
           <wp:simplePos x="0" y="0"/>
           <wp:positionH relativeFrom="column">
             <wp:posOffset>-132715</wp:posOffset>
@@ -12970,7 +12974,7 @@
         <w:vertAlign w:val="baseline"/>
       </w:rPr>
       <w:drawing>
-        <wp:anchor distT="0" distB="0" distL="0" distR="0" simplePos="0" relativeHeight="18" behindDoc="1" locked="0" layoutInCell="1" allowOverlap="1">
+        <wp:anchor distT="0" distB="0" distL="0" distR="0" simplePos="0" relativeHeight="15" behindDoc="1" locked="0" layoutInCell="1" allowOverlap="1">
           <wp:simplePos x="0" y="0"/>
           <wp:positionH relativeFrom="column">
             <wp:posOffset>-132715</wp:posOffset>
@@ -13072,7 +13076,7 @@
         <w:vertAlign w:val="baseline"/>
       </w:rPr>
       <w:drawing>
-        <wp:anchor distT="0" distB="0" distL="0" distR="0" simplePos="0" relativeHeight="18" behindDoc="1" locked="0" layoutInCell="1" allowOverlap="1">
+        <wp:anchor distT="0" distB="0" distL="0" distR="0" simplePos="0" relativeHeight="15" behindDoc="1" locked="0" layoutInCell="1" allowOverlap="1">
           <wp:simplePos x="0" y="0"/>
           <wp:positionH relativeFrom="column">
             <wp:posOffset>-132715</wp:posOffset>
@@ -14236,8 +14240,8 @@
       <w:bCs/>
     </w:rPr>
   </w:style>
-  <w:style w:type="character" w:styleId="Bulletsuser">
-    <w:name w:val="Bullets (user)"/>
+  <w:style w:type="character" w:styleId="Bullets">
+    <w:name w:val="Bullets"/>
     <w:qFormat/>
     <w:rPr>
       <w:rFonts w:ascii="OpenSymbol" w:hAnsi="OpenSymbol" w:eastAsia="OpenSymbol" w:cs="OpenSymbol"/>

</xml_diff>